<commit_message>
Manual: fórmula del nivel máximo y fecha de corte en lenguaje claro
- «d» pasa a «Demanda hasta el próximo envío», ⌈ ⌉ a «redondeado hacia arriba» y √ a
  «raíz cuadrada», en cuatro pasos con un ejemplo paso a paso (Word, página Manual y
  diccionario del Excel).
- «El corte de fecha F es el cierre del día F» pasa a un ejemplo con fechas (el lunes 13/10
  llega el stock al cierre del 12/10).

Co-Authored-By: Claude Opus 5.5 <noreply@anthropic.com>
Claude-Session: https://claude.ai/code/session_01QsuGce7RaayPNyY6mCAwLa
</commit_message>
<xml_diff>
--- a/docs/Manual_Forusight.docx
+++ b/docs/Manual_Forusight.docx
@@ -1891,7 +1891,7 @@
                 <w:sz w:val="20"/>
                 <w:szCs w:val="20"/>
               </w:rPr>
-              <w:t xml:space="preserve">El corte de fecha F es el cierre del día F.</w:t>
+              <w:t xml:space="preserve">Stock con fecha de corte 12/10 = stock al cierre del 12/10.</w:t>
             </w:r>
           </w:p>
         </w:tc>
@@ -2571,7 +2571,7 @@
                 <w:sz w:val="20"/>
                 <w:szCs w:val="20"/>
               </w:rPr>
-              <w:t xml:space="preserve">Stock Físico = stock_bi (cierre del día F)</w:t>
+              <w:t xml:space="preserve">Stock Físico = stock_bi (stock al cierre del día de corte)</w:t>
             </w:r>
           </w:p>
           <w:p>
@@ -2585,7 +2585,7 @@
                 <w:sz w:val="20"/>
                 <w:szCs w:val="20"/>
               </w:rPr>
-              <w:t xml:space="preserve">             − venta neta posterior a F (hasta ayer)</w:t>
+              <w:t xml:space="preserve">             − venta posterior al día de corte (hasta ayer)</w:t>
             </w:r>
           </w:p>
           <w:p>
@@ -2599,7 +2599,7 @@
                 <w:sz w:val="20"/>
                 <w:szCs w:val="20"/>
               </w:rPr>
-              <w:t xml:space="preserve">             + recepcionado posterior a F</w:t>
+              <w:t xml:space="preserve">             + lo recibido después del día de corte</w:t>
             </w:r>
           </w:p>
         </w:tc>
@@ -2613,7 +2613,21 @@
         <w:rPr>
           <w:rFonts w:ascii="Calibri" w:cs="Calibri" w:eastAsia="Calibri" w:hAnsi="Calibri"/>
         </w:rPr>
-        <w:t xml:space="preserve">Con el corte de ayer no cambia nada; un lunes, con el corte del sábado, se ajusta el domingo.</w:t>
+        <w:t xml:space="preserve">La </w:t>
+      </w:r>
+      <w:r>
+        <w:rPr>
+          <w:rFonts w:ascii="Calibri" w:cs="Calibri" w:eastAsia="Calibri" w:hAnsi="Calibri"/>
+          <w:b/>
+          <w:bCs/>
+        </w:rPr>
+        <w:t xml:space="preserve">fecha de corte</w:t>
+      </w:r>
+      <w:r>
+        <w:rPr>
+          <w:rFonts w:ascii="Calibri" w:cs="Calibri" w:eastAsia="Calibri" w:hAnsi="Calibri"/>
+        </w:rPr>
+        <w:t xml:space="preserve"> es el día cuyo cierre trae stock_bi: el lunes 13/10 llega el stock con fecha de corte 12/10, que es el stock al cierre del domingo 12/10. Con el corte de ayer no cambia nada; un lunes con el corte del sábado, se ajusta lo del domingo.</w:t>
       </w:r>
     </w:p>
     <w:p>
@@ -2963,6 +2977,17 @@
         <w:t xml:space="preserve">4.5 Nivel máximo y punto de reorden</w:t>
       </w:r>
     </w:p>
+    <w:p>
+      <w:pPr>
+        <w:spacing w:after="120" w:line="276"/>
+      </w:pPr>
+      <w:r>
+        <w:rPr>
+          <w:rFonts w:ascii="Calibri" w:cs="Calibri" w:eastAsia="Calibri" w:hAnsi="Calibri"/>
+        </w:rPr>
+        <w:t xml:space="preserve">Se calcula en cuatro pasos:</w:t>
+      </w:r>
+    </w:p>
     <w:tbl>
       <w:tblPr>
         <w:tblW w:type="dxa" w:w="9026"/>
@@ -3007,7 +3032,7 @@
                 <w:sz w:val="20"/>
                 <w:szCs w:val="20"/>
               </w:rPr>
-              <w:t xml:space="preserve">d             = Pronóstico × (Leadtime + Período Revisión) ÷ 7</w:t>
+              <w:t xml:space="preserve">1. Demanda hasta el próximo envío</w:t>
             </w:r>
           </w:p>
           <w:p>
@@ -3021,7 +3046,7 @@
                 <w:sz w:val="20"/>
                 <w:szCs w:val="20"/>
               </w:rPr>
-              <w:t xml:space="preserve">Nivel Máximo  = máx( Stock Mínimo ; ⌈ d + 0,84 × √d ⌉ )</w:t>
+              <w:t xml:space="preserve">   = Pronóstico × (Leadtime + Período Revisión) ÷ 7</w:t>
             </w:r>
           </w:p>
           <w:p>
@@ -3035,12 +3060,79 @@
                 <w:sz w:val="20"/>
                 <w:szCs w:val="20"/>
               </w:rPr>
-              <w:t xml:space="preserve">Punto Reorden = Nivel Máximo − 1</w:t>
+              <w:t xml:space="preserve">2. Seguridad = 0,84 × raíz cuadrada(Demanda hasta el próximo envío)</w:t>
+            </w:r>
+          </w:p>
+          <w:p>
+            <w:pPr>
+              <w:spacing w:after="40"/>
+            </w:pPr>
+            <w:r>
+              <w:rPr>
+                <w:rFonts w:ascii="Consolas" w:cs="Consolas" w:eastAsia="Consolas" w:hAnsi="Consolas"/>
+                <w:color w:val="0F172A"/>
+                <w:sz w:val="20"/>
+                <w:szCs w:val="20"/>
+              </w:rPr>
+              <w:t xml:space="preserve">3. Nivel Máximo = el mayor entre:</w:t>
+            </w:r>
+          </w:p>
+          <w:p>
+            <w:pPr>
+              <w:spacing w:after="40"/>
+            </w:pPr>
+            <w:r>
+              <w:rPr>
+                <w:rFonts w:ascii="Consolas" w:cs="Consolas" w:eastAsia="Consolas" w:hAnsi="Consolas"/>
+                <w:color w:val="0F172A"/>
+                <w:sz w:val="20"/>
+                <w:szCs w:val="20"/>
+              </w:rPr>
+              <w:t xml:space="preserve">     · Stock Mínimo, y</w:t>
+            </w:r>
+          </w:p>
+          <w:p>
+            <w:pPr>
+              <w:spacing w:after="40"/>
+            </w:pPr>
+            <w:r>
+              <w:rPr>
+                <w:rFonts w:ascii="Consolas" w:cs="Consolas" w:eastAsia="Consolas" w:hAnsi="Consolas"/>
+                <w:color w:val="0F172A"/>
+                <w:sz w:val="20"/>
+                <w:szCs w:val="20"/>
+              </w:rPr>
+              <w:t xml:space="preserve">     · Demanda + Seguridad, redondeado hacia arriba</w:t>
+            </w:r>
+          </w:p>
+          <w:p>
+            <w:pPr>
+              <w:spacing w:after="40"/>
+            </w:pPr>
+            <w:r>
+              <w:rPr>
+                <w:rFonts w:ascii="Consolas" w:cs="Consolas" w:eastAsia="Consolas" w:hAnsi="Consolas"/>
+                <w:color w:val="0F172A"/>
+                <w:sz w:val="20"/>
+                <w:szCs w:val="20"/>
+              </w:rPr>
+              <w:t xml:space="preserve">4. Punto Reorden = Nivel Máximo − 1</w:t>
             </w:r>
           </w:p>
         </w:tc>
       </w:tr>
     </w:tbl>
+    <w:p>
+      <w:pPr>
+        <w:spacing w:after="120" w:before="120"/>
+      </w:pPr>
+      <w:r>
+        <w:rPr>
+          <w:rFonts w:ascii="Calibri" w:cs="Calibri" w:eastAsia="Calibri" w:hAnsi="Calibri"/>
+        </w:rPr>
+        <w:t xml:space="preserve">Se divide entre 7 para pasar de unidades por semana a unidades por día. El 0,84 da un margen de seguridad de ≈ 80 % por si la tienda vende más de lo esperado.</w:t>
+      </w:r>
+    </w:p>
     <w:tbl>
       <w:tblPr>
         <w:tblW w:type="dxa" w:w="9026"/>
@@ -3101,7 +3193,7 @@
                 <w:sz w:val="20"/>
                 <w:szCs w:val="20"/>
               </w:rPr>
-              <w:t xml:space="preserve">Pronóstico 1 par/semana, Leadtime 3 días, Revisión 2,33 días</w:t>
+              <w:t xml:space="preserve">Pronóstico 1 par/semana · Leadtime 3 días · Revisión 2,33 días</w:t>
             </w:r>
           </w:p>
           <w:p>
@@ -3115,7 +3207,7 @@
                 <w:sz w:val="20"/>
                 <w:szCs w:val="20"/>
               </w:rPr>
-              <w:t xml:space="preserve">d = 1 × 5,33 ÷ 7 = 0,76   →   ⌈0,76 + 0,73⌉ = 2</w:t>
+              <w:t xml:space="preserve">1. Demanda   = 1 × (3 + 2,33) ÷ 7 = 0,76 pares</w:t>
             </w:r>
           </w:p>
           <w:p>
@@ -3129,7 +3221,63 @@
                 <w:sz w:val="20"/>
                 <w:szCs w:val="20"/>
               </w:rPr>
-              <w:t xml:space="preserve">Nivel Máximo = 2   ·   Punto Reorden = 1</w:t>
+              <w:t xml:space="preserve">2. Seguridad = 0,84 × raíz(0,76) = 0,84 × 0,87 = 0,73</w:t>
+            </w:r>
+          </w:p>
+          <w:p>
+            <w:pPr>
+              <w:spacing w:after="40"/>
+            </w:pPr>
+            <w:r>
+              <w:rPr>
+                <w:rFonts w:ascii="Consolas" w:cs="Consolas" w:eastAsia="Consolas" w:hAnsi="Consolas"/>
+                <w:color w:val="0F172A"/>
+                <w:sz w:val="20"/>
+                <w:szCs w:val="20"/>
+              </w:rPr>
+              <w:t xml:space="preserve">3. 0,76 + 0,73 = 1,49  → redondeado hacia arriba = 2</w:t>
+            </w:r>
+          </w:p>
+          <w:p>
+            <w:pPr>
+              <w:spacing w:after="40"/>
+            </w:pPr>
+            <w:r>
+              <w:rPr>
+                <w:rFonts w:ascii="Consolas" w:cs="Consolas" w:eastAsia="Consolas" w:hAnsi="Consolas"/>
+                <w:color w:val="0F172A"/>
+                <w:sz w:val="20"/>
+                <w:szCs w:val="20"/>
+              </w:rPr>
+              <w:t xml:space="preserve">   Stock Mínimo = 1    → Nivel Máximo = 2</w:t>
+            </w:r>
+          </w:p>
+          <w:p>
+            <w:pPr>
+              <w:spacing w:after="40"/>
+            </w:pPr>
+            <w:r>
+              <w:rPr>
+                <w:rFonts w:ascii="Consolas" w:cs="Consolas" w:eastAsia="Consolas" w:hAnsi="Consolas"/>
+                <w:color w:val="0F172A"/>
+                <w:sz w:val="20"/>
+                <w:szCs w:val="20"/>
+              </w:rPr>
+              <w:t xml:space="preserve">4. Punto Reorden = 2 − 1 = 1</w:t>
+            </w:r>
+          </w:p>
+          <w:p>
+            <w:pPr>
+              <w:spacing w:after="40"/>
+            </w:pPr>
+            <w:r>
+              <w:rPr>
+                <w:rFonts w:ascii="Consolas" w:cs="Consolas" w:eastAsia="Consolas" w:hAnsi="Consolas"/>
+                <w:color w:val="0F172A"/>
+                <w:sz w:val="20"/>
+                <w:szCs w:val="20"/>
+              </w:rPr>
+              <w:t xml:space="preserve">→ Con 1 par o menos (stock + tránsito) se envía hasta 2.</w:t>
             </w:r>
           </w:p>
         </w:tc>
@@ -9507,7 +9655,7 @@
                 <w:sz w:val="19"/>
                 <w:szCs w:val="19"/>
               </w:rPr>
-              <w:t xml:space="preserve">SUMA(venta diaria neta, notas de crédito en negativo) con fecha &gt; fecha_corte del stock y antes de hoy (el corte de fecha F es el cierre del día F).</w:t>
+              <w:t xml:space="preserve">SUMA(venta diaria neta, notas de crédito en negativo) con fecha &gt; fecha_corte del stock y antes de hoy (la fecha de corte es el día cuyo cierre trae stock_bi).</w:t>
             </w:r>
           </w:p>
           <w:p>
@@ -10244,7 +10392,7 @@
                 <w:sz w:val="19"/>
                 <w:szCs w:val="19"/>
               </w:rPr>
-              <w:t xml:space="preserve">Nivel Máximo = máx(Stock Mínimo Total; ⌈d + 0,84·√d⌉), con d = Pronóstico × (Leadtime + Período Revisión) ÷ 7 (misma estructura del reporte de distribución; 0,84 ≈ 80 % de nivel de servicio). Ej.: Pronóstico 1 par/sem, Leadtime 3 y Revisión 2,33 → d = 0,76 → ⌈0,76 + 0,73⌉ = 2. Talla sin stock, tránsito ni venta, o modelo sin venta reciente en la tienda: 0 (no se evalúa, como en el reporte).</w:t>
+              <w:t xml:space="preserve">1) Demanda hasta el próximo envío = Pronóstico × (Leadtime + Período Revisión) ÷ 7. 2) Seguridad = 0,84 × raíz cuadrada de esa demanda (≈ 80 % de servicio). 3) Nivel Máximo = el mayor entre Stock Mínimo Total y (Demanda + Seguridad) redondeado hacia arriba. Ej.: Pronóstico 1 par/sem, Leadtime 3 y Revisión 2,33 → Demanda 0,76; Seguridad 0,73; 1,49 → 2. Talla sin stock, tránsito ni venta, o modelo sin venta reciente en la tienda: 0 (no se evalúa, como en el reporte).</w:t>
             </w:r>
           </w:p>
           <w:p>
@@ -10834,7 +10982,7 @@
                 <w:sz w:val="19"/>
                 <w:szCs w:val="19"/>
               </w:rPr>
-              <w:t xml:space="preserve">stock_tiendas del último fecha_corte de este año (el corte de fecha F es el cierre del día F) − venta neta con fecha &gt; F + recepcionado con fecha de recepción &gt; F (con el corte de ayer no cambia; un lunes, con el corte del sábado, ajusta el domingo).</w:t>
+              <w:t xml:space="preserve">stock_tiendas del último fecha_corte (el stock al cierre de ese día; el lunes 13/10 llega el del 12/10) − venta neta posterior a la fecha de corte + lo recibido después de la fecha de corte (con el corte de ayer no cambia; un lunes con el corte del sábado, ajusta el domingo).</w:t>
             </w:r>
           </w:p>
           <w:p>
@@ -13616,7 +13764,7 @@
                 <w:sz w:val="20"/>
                 <w:szCs w:val="20"/>
               </w:rPr>
-              <w:t xml:space="preserve">Corte / cierre del stock</w:t>
+              <w:t xml:space="preserve">Fecha de corte</w:t>
             </w:r>
           </w:p>
         </w:tc>
@@ -13648,7 +13796,7 @@
                 <w:sz w:val="20"/>
                 <w:szCs w:val="20"/>
               </w:rPr>
-              <w:t xml:space="preserve">Fecha F de stock_bi: el stock al cierre del día F.</w:t>
+              <w:t xml:space="preserve">Día cuyo cierre trae stock_bi (ej.: el lunes llega el corte del domingo).</w:t>
             </w:r>
           </w:p>
         </w:tc>

</xml_diff>

<commit_message>
Temporadas desde VERANO 2026 y piso de 7 días en el tránsito
Revisión del 12/10 (HUSH PUPPIES, 9 tiendas en ruta) frente a Neogística: Forusight
enviaba 378 u contra 218.
- Temporadas: se repone VERANO 2026 en adelante (INVIERNO 2027, VERANO 2027…) y
  ESCOLAR 2026; INVIERNO 2026 y anteriores ya no (surtido.temporada_desde). El 12/10 eran
  154 u de INVIERNO 2026. Modelo nuevo sin temporada conocida: se repone.
- Maestro de temporadas actualizado con los reportes del 01 al 12/10 (106 modelos-color
  nuevos): las 36 u «sin temporada» eran modelos VERANO 2026.
- Tránsito: el plazo de cada tienda tiene un piso de 7 días (recepcion.plazo_minimo_dias).
  Con plazos medidos de 1–2 días se perdían 84 u de tránsito real en provincia (CUSCO,
  CAYMA, CHICLAYO, TRUJILLO, PIURA) y se enviaba de más.
- Manual, diccionario y README con las reglas nuevas.

Co-Authored-By: Claude Opus 5.5 <noreply@anthropic.com>
Claude-Session: https://claude.ai/code/session_01QsuGce7RaayPNyY6mCAwLa
</commit_message>
<xml_diff>
--- a/docs/Manual_Forusight.docx
+++ b/docs/Manual_Forusight.docx
@@ -3646,7 +3646,7 @@
         <w:rPr>
           <w:rFonts w:ascii="Calibri" w:cs="Calibri" w:eastAsia="Calibri" w:hAnsi="Calibri"/>
         </w:rPr>
-        <w:t xml:space="preserve">Sólo se reponen las </w:t>
+        <w:t xml:space="preserve">Sólo se reponen </w:t>
       </w:r>
       <w:r>
         <w:rPr>
@@ -3654,13 +3654,27 @@
           <w:b/>
           <w:bCs/>
         </w:rPr>
-        <w:t xml:space="preserve">temporadas comerciales</w:t>
-      </w:r>
-      <w:r>
-        <w:rPr>
-          <w:rFonts w:ascii="Calibri" w:cs="Calibri" w:eastAsia="Calibri" w:hAnsi="Calibri"/>
-        </w:rPr>
-        <w:t xml:space="preserve"> activas (Parámetros → surtido).</w:t>
+        <w:t xml:space="preserve">VERANO 2026 en adelante</w:t>
+      </w:r>
+      <w:r>
+        <w:rPr>
+          <w:rFonts w:ascii="Calibri" w:cs="Calibri" w:eastAsia="Calibri" w:hAnsi="Calibri"/>
+        </w:rPr>
+        <w:t xml:space="preserve"> (VERANO 2026, INVIERNO 2027, VERANO 2027…) y </w:t>
+      </w:r>
+      <w:r>
+        <w:rPr>
+          <w:rFonts w:ascii="Calibri" w:cs="Calibri" w:eastAsia="Calibri" w:hAnsi="Calibri"/>
+          <w:b/>
+          <w:bCs/>
+        </w:rPr>
+        <w:t xml:space="preserve">ESCOLAR 2026</w:t>
+      </w:r>
+      <w:r>
+        <w:rPr>
+          <w:rFonts w:ascii="Calibri" w:cs="Calibri" w:eastAsia="Calibri" w:hAnsi="Calibri"/>
+        </w:rPr>
+        <w:t xml:space="preserve">; INVIERNO 2026 y anteriores no. Un modelo nuevo sin temporada conocida se repone (Parámetros → surtido).</w:t>
       </w:r>
     </w:p>
     <w:p>
@@ -4125,7 +4139,21 @@
         <w:rPr>
           <w:rFonts w:ascii="Calibri" w:cs="Calibri" w:eastAsia="Calibri" w:hAnsi="Calibri"/>
         </w:rPr>
-        <w:t xml:space="preserve"> percentil 95 de los días entre pedido y recepción de los propios pedidos de la tienda (últimos 120 días) + 1 día; sin datos, 7 días. En la práctica: ~1 día en Lima, 2 a 5 en provincia. Un pedido despachado más antiguo ya llegó y quedó sin cerrar.</w:t>
+        <w:t xml:space="preserve"> percentil 95 de los días entre pedido y recepción de los propios pedidos de la tienda (últimos 120 días) + 1 día, con un </w:t>
+      </w:r>
+      <w:r>
+        <w:rPr>
+          <w:rFonts w:ascii="Calibri" w:cs="Calibri" w:eastAsia="Calibri" w:hAnsi="Calibri"/>
+          <w:b/>
+          <w:bCs/>
+        </w:rPr>
+        <w:t xml:space="preserve">mínimo de 7 días</w:t>
+      </w:r>
+      <w:r>
+        <w:rPr>
+          <w:rFonts w:ascii="Calibri" w:cs="Calibri" w:eastAsia="Calibri" w:hAnsi="Calibri"/>
+        </w:rPr>
+        <w:t xml:space="preserve"> (sin datos, 7 días). En la práctica: ~1 día en Lima, 2 a 5 en provincia. Un pedido despachado más antiguo ya llegó y quedó sin cerrar.</w:t>
       </w:r>
     </w:p>
     <w:p>
@@ -8167,7 +8195,7 @@
                 <w:sz w:val="19"/>
                 <w:szCs w:val="19"/>
               </w:rPr>
-              <w:t xml:space="preserve">Temporada comercial del modelo-color (p. ej. VERANO 2026). Sólo se reponen INVIERNO 2026 y VERANO 2026 (Parámetros → surtido); lo demás no aparece en el archivo.</w:t>
+              <w:t xml:space="preserve">Temporada comercial del modelo-color (p. ej. VERANO 2026). Se repone VERANO 2026 en adelante (INVIERNO 2027, VERANO 2027…) y ESCOLAR 2026; INVIERNO 2026 y anteriores no (Parámetros → surtido). Un modelo nuevo sin temporada conocida se repone.</w:t>
             </w:r>
           </w:p>
           <w:p>
@@ -11425,7 +11453,7 @@
                 <w:sz w:val="19"/>
                 <w:szCs w:val="19"/>
               </w:rPr>
-              <w:t xml:space="preserve">Pedidos documentados, en transporte o prerecepcionados dentro del plazo de entrega de la tienda (percentil 95 de sus recepciones + 1 día); más antiguos ya llegaron.</w:t>
+              <w:t xml:space="preserve">Pedidos documentados, en transporte o prerecepcionados dentro del plazo de entrega de la tienda (percentil 95 de sus recepciones + 1 día, mínimo 7 días); más antiguos ya llegaron.</w:t>
             </w:r>
           </w:p>
           <w:p>
@@ -13023,6 +13051,205 @@
                 <w:szCs w:val="20"/>
               </w:rPr>
               <w:t xml:space="preserve">Plazo = percentil 95 + 1 día.</w:t>
+            </w:r>
+          </w:p>
+        </w:tc>
+      </w:tr>
+      <w:tr>
+        <w:trPr>
+          <w:cantSplit/>
+        </w:trPr>
+        <w:tc>
+          <w:tcPr>
+            <w:tcW w:type="dxa" w:w="3900"/>
+            <w:tcBorders>
+              <w:top w:val="single" w:color="CBD5E1" w:sz="4"/>
+              <w:left w:val="single" w:color="CBD5E1" w:sz="4"/>
+              <w:bottom w:val="single" w:color="CBD5E1" w:sz="4"/>
+              <w:right w:val="single" w:color="CBD5E1" w:sz="4"/>
+            </w:tcBorders>
+            <w:shd w:fill="F5F7FC" w:color="auto" w:val="clear"/>
+            <w:tcMar>
+              <w:top w:type="dxa" w:w="80"/>
+              <w:left w:type="dxa" w:w="110"/>
+              <w:bottom w:type="dxa" w:w="80"/>
+              <w:right w:type="dxa" w:w="110"/>
+            </w:tcMar>
+            <w:vAlign w:val="top"/>
+          </w:tcPr>
+          <w:p>
+            <w:pPr>
+              <w:spacing w:after="40"/>
+            </w:pPr>
+            <w:r>
+              <w:rPr>
+                <w:rFonts w:ascii="Calibri" w:cs="Calibri" w:eastAsia="Calibri" w:hAnsi="Calibri"/>
+                <w:sz w:val="20"/>
+                <w:szCs w:val="20"/>
+              </w:rPr>
+              <w:t xml:space="preserve">recepcion.plazo_minimo_dias</w:t>
+            </w:r>
+          </w:p>
+        </w:tc>
+        <w:tc>
+          <w:tcPr>
+            <w:tcW w:type="dxa" w:w="1300"/>
+            <w:tcBorders>
+              <w:top w:val="single" w:color="CBD5E1" w:sz="4"/>
+              <w:left w:val="single" w:color="CBD5E1" w:sz="4"/>
+              <w:bottom w:val="single" w:color="CBD5E1" w:sz="4"/>
+              <w:right w:val="single" w:color="CBD5E1" w:sz="4"/>
+            </w:tcBorders>
+            <w:shd w:fill="F5F7FC" w:color="auto" w:val="clear"/>
+            <w:tcMar>
+              <w:top w:type="dxa" w:w="80"/>
+              <w:left w:type="dxa" w:w="110"/>
+              <w:bottom w:type="dxa" w:w="80"/>
+              <w:right w:type="dxa" w:w="110"/>
+            </w:tcMar>
+            <w:vAlign w:val="top"/>
+          </w:tcPr>
+          <w:p>
+            <w:pPr>
+              <w:spacing w:after="40"/>
+            </w:pPr>
+            <w:r>
+              <w:rPr>
+                <w:rFonts w:ascii="Calibri" w:cs="Calibri" w:eastAsia="Calibri" w:hAnsi="Calibri"/>
+                <w:sz w:val="20"/>
+                <w:szCs w:val="20"/>
+              </w:rPr>
+              <w:t xml:space="preserve">7</w:t>
+            </w:r>
+          </w:p>
+        </w:tc>
+        <w:tc>
+          <w:tcPr>
+            <w:tcW w:type="dxa" w:w="3826"/>
+            <w:tcBorders>
+              <w:top w:val="single" w:color="CBD5E1" w:sz="4"/>
+              <w:left w:val="single" w:color="CBD5E1" w:sz="4"/>
+              <w:bottom w:val="single" w:color="CBD5E1" w:sz="4"/>
+              <w:right w:val="single" w:color="CBD5E1" w:sz="4"/>
+            </w:tcBorders>
+            <w:shd w:fill="F5F7FC" w:color="auto" w:val="clear"/>
+            <w:tcMar>
+              <w:top w:type="dxa" w:w="80"/>
+              <w:left w:type="dxa" w:w="110"/>
+              <w:bottom w:type="dxa" w:w="80"/>
+              <w:right w:type="dxa" w:w="110"/>
+            </w:tcMar>
+            <w:vAlign w:val="top"/>
+          </w:tcPr>
+          <w:p>
+            <w:pPr>
+              <w:spacing w:after="40"/>
+            </w:pPr>
+            <w:r>
+              <w:rPr>
+                <w:rFonts w:ascii="Calibri" w:cs="Calibri" w:eastAsia="Calibri" w:hAnsi="Calibri"/>
+                <w:sz w:val="20"/>
+                <w:szCs w:val="20"/>
+              </w:rPr>
+              <w:t xml:space="preserve">Un pedido despachado cuenta al menos 7 días.</w:t>
+            </w:r>
+          </w:p>
+        </w:tc>
+      </w:tr>
+      <w:tr>
+        <w:trPr>
+          <w:cantSplit/>
+        </w:trPr>
+        <w:tc>
+          <w:tcPr>
+            <w:tcW w:type="dxa" w:w="3900"/>
+            <w:tcBorders>
+              <w:top w:val="single" w:color="CBD5E1" w:sz="4"/>
+              <w:left w:val="single" w:color="CBD5E1" w:sz="4"/>
+              <w:bottom w:val="single" w:color="CBD5E1" w:sz="4"/>
+              <w:right w:val="single" w:color="CBD5E1" w:sz="4"/>
+            </w:tcBorders>
+            <w:tcMar>
+              <w:top w:type="dxa" w:w="80"/>
+              <w:left w:type="dxa" w:w="110"/>
+              <w:bottom w:type="dxa" w:w="80"/>
+              <w:right w:type="dxa" w:w="110"/>
+            </w:tcMar>
+            <w:vAlign w:val="top"/>
+          </w:tcPr>
+          <w:p>
+            <w:pPr>
+              <w:spacing w:after="40"/>
+            </w:pPr>
+            <w:r>
+              <w:rPr>
+                <w:rFonts w:ascii="Calibri" w:cs="Calibri" w:eastAsia="Calibri" w:hAnsi="Calibri"/>
+                <w:sz w:val="20"/>
+                <w:szCs w:val="20"/>
+              </w:rPr>
+              <w:t xml:space="preserve">surtido.temporada_desde / temporadas_reponer</w:t>
+            </w:r>
+          </w:p>
+        </w:tc>
+        <w:tc>
+          <w:tcPr>
+            <w:tcW w:type="dxa" w:w="1300"/>
+            <w:tcBorders>
+              <w:top w:val="single" w:color="CBD5E1" w:sz="4"/>
+              <w:left w:val="single" w:color="CBD5E1" w:sz="4"/>
+              <w:bottom w:val="single" w:color="CBD5E1" w:sz="4"/>
+              <w:right w:val="single" w:color="CBD5E1" w:sz="4"/>
+            </w:tcBorders>
+            <w:tcMar>
+              <w:top w:type="dxa" w:w="80"/>
+              <w:left w:type="dxa" w:w="110"/>
+              <w:bottom w:type="dxa" w:w="80"/>
+              <w:right w:type="dxa" w:w="110"/>
+            </w:tcMar>
+            <w:vAlign w:val="top"/>
+          </w:tcPr>
+          <w:p>
+            <w:pPr>
+              <w:spacing w:after="40"/>
+            </w:pPr>
+            <w:r>
+              <w:rPr>
+                <w:rFonts w:ascii="Calibri" w:cs="Calibri" w:eastAsia="Calibri" w:hAnsi="Calibri"/>
+                <w:sz w:val="20"/>
+                <w:szCs w:val="20"/>
+              </w:rPr>
+              <w:t xml:space="preserve">VERANO 2026 / ESCOLAR 2026</w:t>
+            </w:r>
+          </w:p>
+        </w:tc>
+        <w:tc>
+          <w:tcPr>
+            <w:tcW w:type="dxa" w:w="3826"/>
+            <w:tcBorders>
+              <w:top w:val="single" w:color="CBD5E1" w:sz="4"/>
+              <w:left w:val="single" w:color="CBD5E1" w:sz="4"/>
+              <w:bottom w:val="single" w:color="CBD5E1" w:sz="4"/>
+              <w:right w:val="single" w:color="CBD5E1" w:sz="4"/>
+            </w:tcBorders>
+            <w:tcMar>
+              <w:top w:type="dxa" w:w="80"/>
+              <w:left w:type="dxa" w:w="110"/>
+              <w:bottom w:type="dxa" w:w="80"/>
+              <w:right w:type="dxa" w:w="110"/>
+            </w:tcMar>
+            <w:vAlign w:val="top"/>
+          </w:tcPr>
+          <w:p>
+            <w:pPr>
+              <w:spacing w:after="40"/>
+            </w:pPr>
+            <w:r>
+              <w:rPr>
+                <w:rFonts w:ascii="Calibri" w:cs="Calibri" w:eastAsia="Calibri" w:hAnsi="Calibri"/>
+                <w:sz w:val="20"/>
+                <w:szCs w:val="20"/>
+              </w:rPr>
+              <w:t xml:space="preserve">Temporadas que se reponen.</w:t>
             </w:r>
           </w:p>
         </w:tc>

</xml_diff>

<commit_message>
Retira el llenado inicial de marca nueva: Forusight sólo repone
Se quita la opción «Llenado inicial de marca nueva» de «Nueva corrida», su
parámetro (llenado_inicial), el motivo ENVIO_LLENADO, el aviso del Dashboard y
las tiendas «marca nueva» de la carga. Reciben sólo las tiendas con stock en sala
o venta reciente de la marca; las tiendas AZALEIA se identifican por la venta.
Las corridas guardadas con el parámetro viejo siguen abriendo. Manual al día.

Co-Authored-By: Claude Opus 5.5 <noreply@anthropic.com>
Claude-Session: https://claude.ai/code/session_015gEqVLtcWtVbqxn3ygMT9y
</commit_message>
<xml_diff>
--- a/docs/Manual_Forusight.docx
+++ b/docs/Manual_Forusight.docx
@@ -1582,22 +1582,6 @@
         <w:rPr>
           <w:rFonts w:ascii="Calibri" w:cs="Calibri" w:eastAsia="Calibri" w:hAnsi="Calibri"/>
         </w:rPr>
-        <w:t xml:space="preserve">Activa «Llenado inicial de marca nueva» sólo para el primer envío de una marca nueva.</w:t>
-      </w:r>
-    </w:p>
-    <w:p>
-      <w:pPr>
-        <w:pStyle w:val="ListParagraph"/>
-        <w:numPr>
-          <w:ilvl w:val="0"/>
-          <w:numId w:val="3"/>
-        </w:numPr>
-        <w:spacing w:after="60"/>
-      </w:pPr>
-      <w:r>
-        <w:rPr>
-          <w:rFonts w:ascii="Calibri" w:cs="Calibri" w:eastAsia="Calibri" w:hAnsi="Calibri"/>
-        </w:rPr>
         <w:t xml:space="preserve">Pulsa </w:t>
       </w:r>
       <w:r>
@@ -4864,30 +4848,6 @@
           <w:rFonts w:ascii="Calibri" w:cs="Calibri" w:eastAsia="Calibri" w:hAnsi="Calibri"/>
         </w:rPr>
         <w:t xml:space="preserve"> se estima con otras tiendas o con su tienda espejo.</w:t>
-      </w:r>
-    </w:p>
-    <w:p>
-      <w:pPr>
-        <w:pStyle w:val="ListParagraph"/>
-        <w:numPr>
-          <w:ilvl w:val="0"/>
-          <w:numId w:val="2"/>
-        </w:numPr>
-        <w:spacing w:after="60"/>
-      </w:pPr>
-      <w:r>
-        <w:rPr>
-          <w:rFonts w:ascii="Calibri" w:cs="Calibri" w:eastAsia="Calibri" w:hAnsi="Calibri"/>
-          <w:b/>
-          <w:bCs/>
-        </w:rPr>
-        <w:t xml:space="preserve">Marca nueva sin stock:</w:t>
-      </w:r>
-      <w:r>
-        <w:rPr>
-          <w:rFonts w:ascii="Calibri" w:cs="Calibri" w:eastAsia="Calibri" w:hAnsi="Calibri"/>
-        </w:rPr>
-        <w:t xml:space="preserve"> activa «Llenado inicial» para su primer envío (1 por talla core).</w:t>
       </w:r>
     </w:p>
     <w:p>

</xml_diff>

<commit_message>
Forusight independiente de Neogística: sólo se compara con ella
- Nivel, punto de reorden y «sin espacio» siempre los calcula Forusight: ya no se copian de un
  reporte de Neogística de hasta 3 días (nivel_neo.dias_nivel_reporte: 0). El 12/10 la
  comparación daba «nivel igual 100 %» justamente porque se copiaba.
- Se quita la carga de reportes de Neogística en Parámetros (y su registro en la sesión).
- Nueva página «Comparar con Neogística»: pone la corrida (o un archivo Forusight) al lado
  del reporte del mismo día, sin que entre al cálculo; resumen, causas, por tienda, detalle
  y descarga en Excel (forusight/export/comparar.py).
- Manual, diccionario y README actualizados.

Co-Authored-By: Claude Opus 5.5 <noreply@anthropic.com>
Claude-Session: https://claude.ai/code/session_01QsuGce7RaayPNyY6mCAwLa
</commit_message>
<xml_diff>
--- a/docs/Manual_Forusight.docx
+++ b/docs/Manual_Forusight.docx
@@ -5521,7 +5521,7 @@
                 <w:sz w:val="20"/>
                 <w:szCs w:val="20"/>
               </w:rPr>
-              <w:t xml:space="preserve">Reglas del motor (formulario o YAML). Planificación: opcional.</w:t>
+              <w:t xml:space="preserve">Reglas del motor (formulario o YAML).</w:t>
             </w:r>
           </w:p>
         </w:tc>
@@ -5558,7 +5558,7 @@
                 <w:sz w:val="20"/>
                 <w:szCs w:val="20"/>
               </w:rPr>
-              <w:t xml:space="preserve">Manual</w:t>
+              <w:t xml:space="preserve">Comparar con Neogística</w:t>
             </w:r>
           </w:p>
         </w:tc>
@@ -5590,7 +5590,7 @@
                 <w:sz w:val="20"/>
                 <w:szCs w:val="20"/>
               </w:rPr>
-              <w:t xml:space="preserve">Este manual y el diccionario de columnas.</w:t>
+              <w:t xml:space="preserve">Pone lado a lado la corrida y el reporte de Neogística, sólo para revisar.</w:t>
             </w:r>
           </w:p>
         </w:tc>
@@ -5626,6 +5626,74 @@
                 <w:sz w:val="20"/>
                 <w:szCs w:val="20"/>
               </w:rPr>
+              <w:t xml:space="preserve">Manual</w:t>
+            </w:r>
+          </w:p>
+        </w:tc>
+        <w:tc>
+          <w:tcPr>
+            <w:tcW w:type="dxa" w:w="6726"/>
+            <w:tcBorders>
+              <w:top w:val="single" w:color="CBD5E1" w:sz="4"/>
+              <w:left w:val="single" w:color="CBD5E1" w:sz="4"/>
+              <w:bottom w:val="single" w:color="CBD5E1" w:sz="4"/>
+              <w:right w:val="single" w:color="CBD5E1" w:sz="4"/>
+            </w:tcBorders>
+            <w:tcMar>
+              <w:top w:type="dxa" w:w="80"/>
+              <w:left w:type="dxa" w:w="110"/>
+              <w:bottom w:type="dxa" w:w="80"/>
+              <w:right w:type="dxa" w:w="110"/>
+            </w:tcMar>
+            <w:vAlign w:val="top"/>
+          </w:tcPr>
+          <w:p>
+            <w:pPr>
+              <w:spacing w:after="40"/>
+            </w:pPr>
+            <w:r>
+              <w:rPr>
+                <w:rFonts w:ascii="Calibri" w:cs="Calibri" w:eastAsia="Calibri" w:hAnsi="Calibri"/>
+                <w:sz w:val="20"/>
+                <w:szCs w:val="20"/>
+              </w:rPr>
+              <w:t xml:space="preserve">Este manual y el diccionario de columnas.</w:t>
+            </w:r>
+          </w:p>
+        </w:tc>
+      </w:tr>
+      <w:tr>
+        <w:trPr>
+          <w:cantSplit/>
+        </w:trPr>
+        <w:tc>
+          <w:tcPr>
+            <w:tcW w:type="dxa" w:w="2300"/>
+            <w:tcBorders>
+              <w:top w:val="single" w:color="CBD5E1" w:sz="4"/>
+              <w:left w:val="single" w:color="CBD5E1" w:sz="4"/>
+              <w:bottom w:val="single" w:color="CBD5E1" w:sz="4"/>
+              <w:right w:val="single" w:color="CBD5E1" w:sz="4"/>
+            </w:tcBorders>
+            <w:shd w:fill="F5F7FC" w:color="auto" w:val="clear"/>
+            <w:tcMar>
+              <w:top w:type="dxa" w:w="80"/>
+              <w:left w:type="dxa" w:w="110"/>
+              <w:bottom w:type="dxa" w:w="80"/>
+              <w:right w:type="dxa" w:w="110"/>
+            </w:tcMar>
+            <w:vAlign w:val="top"/>
+          </w:tcPr>
+          <w:p>
+            <w:pPr>
+              <w:spacing w:after="40"/>
+            </w:pPr>
+            <w:r>
+              <w:rPr>
+                <w:rFonts w:ascii="Calibri" w:cs="Calibri" w:eastAsia="Calibri" w:hAnsi="Calibri"/>
+                <w:sz w:val="20"/>
+                <w:szCs w:val="20"/>
+              </w:rPr>
               <w:t xml:space="preserve">Conexión (admin)</w:t>
             </w:r>
           </w:p>
@@ -5639,6 +5707,7 @@
               <w:bottom w:val="single" w:color="CBD5E1" w:sz="4"/>
               <w:right w:val="single" w:color="CBD5E1" w:sz="4"/>
             </w:tcBorders>
+            <w:shd w:fill="F5F7FC" w:color="auto" w:val="clear"/>
             <w:tcMar>
               <w:top w:type="dxa" w:w="80"/>
               <w:left w:type="dxa" w:w="110"/>
@@ -6168,7 +6237,46 @@
         <w:rPr>
           <w:rFonts w:ascii="Calibri" w:cs="Calibri" w:eastAsia="Calibri" w:hAnsi="Calibri"/>
         </w:rPr>
-        <w:t xml:space="preserve">Para validar Forusight frente al reporte de distribución de Neogística, sigue este orden:</w:t>
+        <w:t xml:space="preserve">La página </w:t>
+      </w:r>
+      <w:r>
+        <w:rPr>
+          <w:rFonts w:ascii="Calibri" w:cs="Calibri" w:eastAsia="Calibri" w:hAnsi="Calibri"/>
+          <w:b/>
+          <w:bCs/>
+        </w:rPr>
+        <w:t xml:space="preserve">Comparar con Neogística</w:t>
+      </w:r>
+      <w:r>
+        <w:rPr>
+          <w:rFonts w:ascii="Calibri" w:cs="Calibri" w:eastAsia="Calibri" w:hAnsi="Calibri"/>
+        </w:rPr>
+        <w:t xml:space="preserve"> lo hace sola: sube el reporte del mismo día y muestra por tienda y por causa dónde difieren, con descarga en Excel. El reporte sólo se lee para comparar: </w:t>
+      </w:r>
+      <w:r>
+        <w:rPr>
+          <w:rFonts w:ascii="Calibri" w:cs="Calibri" w:eastAsia="Calibri" w:hAnsi="Calibri"/>
+          <w:b/>
+          <w:bCs/>
+        </w:rPr>
+        <w:t xml:space="preserve">no entra al cálculo de Forusight</w:t>
+      </w:r>
+      <w:r>
+        <w:rPr>
+          <w:rFonts w:ascii="Calibri" w:cs="Calibri" w:eastAsia="Calibri" w:hAnsi="Calibri"/>
+        </w:rPr>
+        <w:t xml:space="preserve">.</w:t>
+      </w:r>
+    </w:p>
+    <w:p>
+      <w:pPr>
+        <w:spacing w:after="120" w:line="276"/>
+      </w:pPr>
+      <w:r>
+        <w:rPr>
+          <w:rFonts w:ascii="Calibri" w:cs="Calibri" w:eastAsia="Calibri" w:hAnsi="Calibri"/>
+        </w:rPr>
+        <w:t xml:space="preserve">Si lo revisas a mano, sigue este orden:</w:t>
       </w:r>
     </w:p>
     <w:p>
@@ -10273,7 +10381,7 @@
                 <w:sz w:val="19"/>
                 <w:szCs w:val="19"/>
               </w:rPr>
-              <w:t xml:space="preserve">Punto Reorden = Nivel Máximo − 1. Se pide sólo si Posición ≤ Punto Reorden. (Si el maestro guardado trae esa tienda × SKU de un reporte de hasta 3 días, usa su punto de reorden.)</w:t>
+              <w:t xml:space="preserve">Punto Reorden = Nivel Máximo − 1. Se pide sólo si Posición ≤ Punto Reorden. Siempre lo calcula Forusight (no se copia de ningún reporte).</w:t>
             </w:r>
           </w:p>
           <w:p>

</xml_diff>

<commit_message>
Mantenedores propios de temporadas y stock mínimo en Parámetros
El stock mínimo y la temporada comercial son datos de Forus: se editan en
Parámetros (buscar, editar, cargar Excel, historial con usuario y fecha),
se guardan en GitHub y mandan sobre el maestro desde la próxima corrida.

Co-Authored-By: Claude Opus 5.5 <noreply@anthropic.com>
Claude-Session: https://claude.ai/code/session_01QsuGce7RaayPNyY6mCAwLa
</commit_message>
<xml_diff>
--- a/docs/Manual_Forusight.docx
+++ b/docs/Manual_Forusight.docx
@@ -2358,7 +2358,7 @@
                 <w:sz w:val="20"/>
                 <w:szCs w:val="20"/>
               </w:rPr>
-              <w:t xml:space="preserve">Maestro de planificación guardado</w:t>
+              <w:t xml:space="preserve">Maestro de planificación guardado (de Forus) + Parámetros → Stock mínimo</w:t>
             </w:r>
           </w:p>
         </w:tc>
@@ -2426,6 +2426,105 @@
                 <w:sz w:val="20"/>
                 <w:szCs w:val="20"/>
               </w:rPr>
+              <w:t xml:space="preserve">Temporada comercial</w:t>
+            </w:r>
+          </w:p>
+        </w:tc>
+        <w:tc>
+          <w:tcPr>
+            <w:tcW w:type="dxa" w:w="3000"/>
+            <w:tcBorders>
+              <w:top w:val="single" w:color="CBD5E1" w:sz="4"/>
+              <w:left w:val="single" w:color="CBD5E1" w:sz="4"/>
+              <w:bottom w:val="single" w:color="CBD5E1" w:sz="4"/>
+              <w:right w:val="single" w:color="CBD5E1" w:sz="4"/>
+            </w:tcBorders>
+            <w:tcMar>
+              <w:top w:type="dxa" w:w="80"/>
+              <w:left w:type="dxa" w:w="110"/>
+              <w:bottom w:type="dxa" w:w="80"/>
+              <w:right w:type="dxa" w:w="110"/>
+            </w:tcMar>
+            <w:vAlign w:val="top"/>
+          </w:tcPr>
+          <w:p>
+            <w:pPr>
+              <w:spacing w:after="40"/>
+            </w:pPr>
+            <w:r>
+              <w:rPr>
+                <w:rFonts w:ascii="Calibri" w:cs="Calibri" w:eastAsia="Calibri" w:hAnsi="Calibri"/>
+                <w:sz w:val="20"/>
+                <w:szCs w:val="20"/>
+              </w:rPr>
+              <w:t xml:space="preserve">Maestro de temporadas + Parámetros → Temporadas</w:t>
+            </w:r>
+          </w:p>
+        </w:tc>
+        <w:tc>
+          <w:tcPr>
+            <w:tcW w:type="dxa" w:w="3426"/>
+            <w:tcBorders>
+              <w:top w:val="single" w:color="CBD5E1" w:sz="4"/>
+              <w:left w:val="single" w:color="CBD5E1" w:sz="4"/>
+              <w:bottom w:val="single" w:color="CBD5E1" w:sz="4"/>
+              <w:right w:val="single" w:color="CBD5E1" w:sz="4"/>
+            </w:tcBorders>
+            <w:tcMar>
+              <w:top w:type="dxa" w:w="80"/>
+              <w:left w:type="dxa" w:w="110"/>
+              <w:bottom w:type="dxa" w:w="80"/>
+              <w:right w:type="dxa" w:w="110"/>
+            </w:tcMar>
+            <w:vAlign w:val="top"/>
+          </w:tcPr>
+          <w:p>
+            <w:pPr>
+              <w:spacing w:after="40"/>
+            </w:pPr>
+            <w:r>
+              <w:rPr>
+                <w:rFonts w:ascii="Calibri" w:cs="Calibri" w:eastAsia="Calibri" w:hAnsi="Calibri"/>
+                <w:sz w:val="20"/>
+                <w:szCs w:val="20"/>
+              </w:rPr>
+              <w:t xml:space="preserve">Decide qué se repone (ver 4.8).</w:t>
+            </w:r>
+          </w:p>
+        </w:tc>
+      </w:tr>
+      <w:tr>
+        <w:trPr>
+          <w:cantSplit/>
+        </w:trPr>
+        <w:tc>
+          <w:tcPr>
+            <w:tcW w:type="dxa" w:w="2600"/>
+            <w:tcBorders>
+              <w:top w:val="single" w:color="CBD5E1" w:sz="4"/>
+              <w:left w:val="single" w:color="CBD5E1" w:sz="4"/>
+              <w:bottom w:val="single" w:color="CBD5E1" w:sz="4"/>
+              <w:right w:val="single" w:color="CBD5E1" w:sz="4"/>
+            </w:tcBorders>
+            <w:shd w:fill="F5F7FC" w:color="auto" w:val="clear"/>
+            <w:tcMar>
+              <w:top w:type="dxa" w:w="80"/>
+              <w:left w:type="dxa" w:w="110"/>
+              <w:bottom w:type="dxa" w:w="80"/>
+              <w:right w:type="dxa" w:w="110"/>
+            </w:tcMar>
+            <w:vAlign w:val="top"/>
+          </w:tcPr>
+          <w:p>
+            <w:pPr>
+              <w:spacing w:after="40"/>
+            </w:pPr>
+            <w:r>
+              <w:rPr>
+                <w:rFonts w:ascii="Calibri" w:cs="Calibri" w:eastAsia="Calibri" w:hAnsi="Calibri"/>
+                <w:sz w:val="20"/>
+                <w:szCs w:val="20"/>
+              </w:rPr>
               <w:t xml:space="preserve">Bloqueos</w:t>
             </w:r>
           </w:p>
@@ -2439,6 +2538,7 @@
               <w:bottom w:val="single" w:color="CBD5E1" w:sz="4"/>
               <w:right w:val="single" w:color="CBD5E1" w:sz="4"/>
             </w:tcBorders>
+            <w:shd w:fill="F5F7FC" w:color="auto" w:val="clear"/>
             <w:tcMar>
               <w:top w:type="dxa" w:w="80"/>
               <w:left w:type="dxa" w:w="110"/>
@@ -2470,6 +2570,7 @@
               <w:bottom w:val="single" w:color="CBD5E1" w:sz="4"/>
               <w:right w:val="single" w:color="CBD5E1" w:sz="4"/>
             </w:tcBorders>
+            <w:shd w:fill="F5F7FC" w:color="auto" w:val="clear"/>
             <w:tcMar>
               <w:top w:type="dxa" w:w="80"/>
               <w:left w:type="dxa" w:w="110"/>
@@ -2860,7 +2961,35 @@
         <w:rPr>
           <w:rFonts w:ascii="Calibri" w:cs="Calibri" w:eastAsia="Calibri" w:hAnsi="Calibri"/>
         </w:rPr>
-        <w:t xml:space="preserve">Es el </w:t>
+        <w:t xml:space="preserve">Es un dato </w:t>
+      </w:r>
+      <w:r>
+        <w:rPr>
+          <w:rFonts w:ascii="Calibri" w:cs="Calibri" w:eastAsia="Calibri" w:hAnsi="Calibri"/>
+          <w:b/>
+          <w:bCs/>
+        </w:rPr>
+        <w:t xml:space="preserve">propio de Forus</w:t>
+      </w:r>
+      <w:r>
+        <w:rPr>
+          <w:rFonts w:ascii="Calibri" w:cs="Calibri" w:eastAsia="Calibri" w:hAnsi="Calibri"/>
+        </w:rPr>
+        <w:t xml:space="preserve">: no se vuelve a pedir a Neogística. Primero vale lo guardado en </w:t>
+      </w:r>
+      <w:r>
+        <w:rPr>
+          <w:rFonts w:ascii="Calibri" w:cs="Calibri" w:eastAsia="Calibri" w:hAnsi="Calibri"/>
+          <w:b/>
+          <w:bCs/>
+        </w:rPr>
+        <w:t xml:space="preserve">Parámetros → Stock mínimo</w:t>
+      </w:r>
+      <w:r>
+        <w:rPr>
+          <w:rFonts w:ascii="Calibri" w:cs="Calibri" w:eastAsia="Calibri" w:hAnsi="Calibri"/>
+        </w:rPr>
+        <w:t xml:space="preserve"> (con usuario y fecha); si no hay, el </w:t>
       </w:r>
       <w:r>
         <w:rPr>
@@ -2963,7 +3092,21 @@
         <w:rPr>
           <w:rFonts w:ascii="Calibri" w:cs="Calibri" w:eastAsia="Calibri" w:hAnsi="Calibri"/>
         </w:rPr>
-        <w:t xml:space="preserve">. Con los reportes del 01 al 12/10/2026, el stock mínimo cambia en ~3,5 % de las claves entre reportes y el último valor conocido acierta el 94,5 % una semana después.</w:t>
+        <w:t xml:space="preserve">. Con los reportes del 01 al 12/10/2026, el stock mínimo cambia en ~3,5 % de las claves entre reportes y el último valor conocido acierta el 94,5 % una semana después. Con el stock mínimo guardado el nivel máximo coincide con el de Neogística en el </w:t>
+      </w:r>
+      <w:r>
+        <w:rPr>
+          <w:rFonts w:ascii="Calibri" w:cs="Calibri" w:eastAsia="Calibri" w:hAnsi="Calibri"/>
+          <w:b/>
+          <w:bCs/>
+        </w:rPr>
+        <w:t xml:space="preserve">95,4 %</w:t>
+      </w:r>
+      <w:r>
+        <w:rPr>
+          <w:rFonts w:ascii="Calibri" w:cs="Calibri" w:eastAsia="Calibri" w:hAnsi="Calibri"/>
+        </w:rPr>
+        <w:t xml:space="preserve"> de las tienda × talla; una regla basada en venta no pasa del 84 %, por eso se conserva y sólo se edita cuando el planificador lo cambia.</w:t>
       </w:r>
     </w:p>
     <w:p>
@@ -3674,7 +3817,21 @@
         <w:rPr>
           <w:rFonts w:ascii="Calibri" w:cs="Calibri" w:eastAsia="Calibri" w:hAnsi="Calibri"/>
         </w:rPr>
-        <w:t xml:space="preserve">; INVIERNO 2026 y anteriores no. Un modelo nuevo sin temporada conocida se repone (Parámetros → surtido).</w:t>
+        <w:t xml:space="preserve">; INVIERNO 2026 y anteriores no. Un modelo nuevo sin temporada conocida se repone. La temporada de cada modelo-color se corrige en </w:t>
+      </w:r>
+      <w:r>
+        <w:rPr>
+          <w:rFonts w:ascii="Calibri" w:cs="Calibri" w:eastAsia="Calibri" w:hAnsi="Calibri"/>
+          <w:b/>
+          <w:bCs/>
+        </w:rPr>
+        <w:t xml:space="preserve">Parámetros → Temporadas</w:t>
+      </w:r>
+      <w:r>
+        <w:rPr>
+          <w:rFonts w:ascii="Calibri" w:cs="Calibri" w:eastAsia="Calibri" w:hAnsi="Calibri"/>
+        </w:rPr>
+        <w:t xml:space="preserve">.</w:t>
       </w:r>
     </w:p>
     <w:p>
@@ -5521,7 +5678,7 @@
                 <w:sz w:val="20"/>
                 <w:szCs w:val="20"/>
               </w:rPr>
-              <w:t xml:space="preserve">Reglas del motor (formulario o YAML).</w:t>
+              <w:t xml:space="preserve">Reglas del motor (formulario o YAML) y los mantenedores Temporadas y Stock mínimo (buscar, editar, cargar Excel, historial).</w:t>
             </w:r>
           </w:p>
         </w:tc>
@@ -8316,7 +8473,7 @@
                 <w:sz w:val="19"/>
                 <w:szCs w:val="19"/>
               </w:rPr>
-              <w:t xml:space="preserve">Maestro de temporadas guardado en Forusight (aprendido de reportes anteriores y del reporte de bloqueos; ARTI no trae la temporada comercial).</w:t>
+              <w:t xml:space="preserve">Maestro de temporadas guardado en Forusight (aprendido de reportes anteriores y del reporte de bloqueos; ARTI no trae la temporada comercial). Lo guardado en Parámetros → Temporadas manda sobre el maestro.</w:t>
             </w:r>
           </w:p>
           <w:p>
@@ -8338,7 +8495,7 @@
                 <w:sz w:val="16"/>
                 <w:szCs w:val="16"/>
               </w:rPr>
-              <w:t xml:space="preserve">config/temporadas.csv.gz</w:t>
+              <w:t xml:space="preserve">config/temporadas.csv.gz + mantenedor de temporadas</w:t>
             </w:r>
           </w:p>
         </w:tc>
@@ -10676,7 +10833,7 @@
                 <w:sz w:val="19"/>
                 <w:szCs w:val="19"/>
               </w:rPr>
-              <w:t xml:space="preserve">Último valor conocido de la tienda × SKU en el maestro de planificación guardado (no vence: cambia en ~3,5 % de las claves entre reportes y el último valor acierta el 94,5 % una semana después). Si la clave no está: el más frecuente del SKU en otras tiendas, luego de la marca × prenda × talla, luego de la marca × prenda; si nada, 1. Una tienda sin claves propias toma las de su tienda espejo.</w:t>
+              <w:t xml:space="preserve">Primero, el valor guardado en Parámetros → Stock mínimo; si no, el último valor conocido de la tienda × SKU en el maestro de planificación guardado (no vence: cambia en ~3,5 % de las claves entre reportes y el último valor acierta el 94,5 % una semana después). Si la clave no está: el más frecuente del SKU en otras tiendas, luego de la marca × prenda × talla, luego de la marca × prenda; si nada, 1. Una tienda sin claves propias toma las de su tienda espejo.</w:t>
             </w:r>
           </w:p>
           <w:p>
@@ -10698,7 +10855,7 @@
                 <w:sz w:val="16"/>
                 <w:szCs w:val="16"/>
               </w:rPr>
-              <w:t xml:space="preserve">config/planificacion_claves.csv.gz (maestro guardado)</w:t>
+              <w:t xml:space="preserve">config/planificacion_claves.csv.gz (maestro guardado) + mantenedor de stock mínimo</w:t>
             </w:r>
           </w:p>
         </w:tc>

</xml_diff>